<commit_message>
hnh-sct-vn v1.4.0: bản chốt GP Argon 2 xe + thông lệ ghi cột trọng tải 'Theo giấy tờ của phương tiện' + tinh chỉnh quy tắc mệnh đề niên hạn
</commit_message>
<xml_diff>
--- a/hnh-sct-vn/skills/hnh-sct-vn/vi-du-thuc-te/soi-phuong-nam-argon-nh3-072026/GP-SoiPhuongNam-Argon-loai2-2xe.docx
+++ b/hnh-sct-vn/skills/hnh-sct-vn/vi-du-thuc-te/soi-phuong-nam-argon-nh3-072026/GP-SoiPhuongNam-Argon-loai2-2xe.docx
@@ -1,6 +1,6 @@
 
 <file path=word/document.xml><?xml version="1.0" encoding="utf-8"?>
-<w:document xmlns:wpc="http://schemas.microsoft.com/office/word/2010/wordprocessingCanvas" xmlns:cx="http://schemas.microsoft.com/office/drawing/2014/chartex" xmlns:mc="http://schemas.openxmlformats.org/markup-compatibility/2006" xmlns:o="urn:schemas-microsoft-com:office:office" xmlns:r="http://schemas.openxmlformats.org/officeDocument/2006/relationships" xmlns:m="http://schemas.openxmlformats.org/officeDocument/2006/math" xmlns:v="urn:schemas-microsoft-com:vml" xmlns:wp14="http://schemas.microsoft.com/office/word/2010/wordprocessingDrawing" xmlns:wp="http://schemas.openxmlformats.org/drawingml/2006/wordprocessingDrawing" xmlns:w10="urn:schemas-microsoft-com:office:word" xmlns:w="http://schemas.openxmlformats.org/wordprocessingml/2006/main" xmlns:w14="http://schemas.microsoft.com/office/word/2010/wordml" xmlns:w15="http://schemas.microsoft.com/office/word/2012/wordml" xmlns:w16se="http://schemas.microsoft.com/office/word/2015/wordml/symex" xmlns:wpg="http://schemas.microsoft.com/office/word/2010/wordprocessingGroup" xmlns:wpi="http://schemas.microsoft.com/office/word/2010/wordprocessingInk" xmlns:wne="http://schemas.microsoft.com/office/word/2006/wordml" xmlns:wps="http://schemas.microsoft.com/office/word/2010/wordprocessingShape" mc:Ignorable="w14 w15 w16se wp14">
+<w:document xmlns:wpc="http://schemas.microsoft.com/office/word/2010/wordprocessingCanvas" xmlns:cx="http://schemas.microsoft.com/office/drawing/2014/chartex" xmlns:cx1="http://schemas.microsoft.com/office/drawing/2015/9/8/chartex" xmlns:cx2="http://schemas.microsoft.com/office/drawing/2015/10/21/chartex" xmlns:cx3="http://schemas.microsoft.com/office/drawing/2016/5/9/chartex" xmlns:cx4="http://schemas.microsoft.com/office/drawing/2016/5/10/chartex" xmlns:cx5="http://schemas.microsoft.com/office/drawing/2016/5/11/chartex" xmlns:cx6="http://schemas.microsoft.com/office/drawing/2016/5/12/chartex" xmlns:cx7="http://schemas.microsoft.com/office/drawing/2016/5/13/chartex" xmlns:cx8="http://schemas.microsoft.com/office/drawing/2016/5/14/chartex" xmlns:mc="http://schemas.openxmlformats.org/markup-compatibility/2006" xmlns:aink="http://schemas.microsoft.com/office/drawing/2016/ink" xmlns:am3d="http://schemas.microsoft.com/office/drawing/2017/model3d" xmlns:o="urn:schemas-microsoft-com:office:office" xmlns:r="http://schemas.openxmlformats.org/officeDocument/2006/relationships" xmlns:m="http://schemas.openxmlformats.org/officeDocument/2006/math" xmlns:v="urn:schemas-microsoft-com:vml" xmlns:wp14="http://schemas.microsoft.com/office/word/2010/wordprocessingDrawing" xmlns:wp="http://schemas.openxmlformats.org/drawingml/2006/wordprocessingDrawing" xmlns:w10="urn:schemas-microsoft-com:office:word" xmlns:w="http://schemas.openxmlformats.org/wordprocessingml/2006/main" xmlns:w14="http://schemas.microsoft.com/office/word/2010/wordml" xmlns:w15="http://schemas.microsoft.com/office/word/2012/wordml" xmlns:w16cex="http://schemas.microsoft.com/office/word/2018/wordml/cex" xmlns:w16cid="http://schemas.microsoft.com/office/word/2016/wordml/cid" xmlns:w16="http://schemas.microsoft.com/office/word/2018/wordml" xmlns:w16sdtdh="http://schemas.microsoft.com/office/word/2020/wordml/sdtdatahash" xmlns:w16se="http://schemas.microsoft.com/office/word/2015/wordml/symex" xmlns:wpg="http://schemas.microsoft.com/office/word/2010/wordprocessingGroup" xmlns:wpi="http://schemas.microsoft.com/office/word/2010/wordprocessingInk" xmlns:wne="http://schemas.microsoft.com/office/word/2006/wordml" xmlns:wps="http://schemas.microsoft.com/office/word/2010/wordprocessingShape" mc:Ignorable="w14 w15 w16se w16cid w16 w16cex w16sdtdh wp14">
   <w:body>
     <w:tbl>
       <w:tblPr>
@@ -102,7 +102,7 @@
               <mc:AlternateContent>
                 <mc:Choice Requires="wps">
                   <w:drawing>
-                    <wp:anchor distT="4294967294" distB="4294967294" distL="114300" distR="114300" simplePos="0" relativeHeight="251672576" behindDoc="0" locked="0" layoutInCell="1" allowOverlap="1" wp14:anchorId="633649F3" wp14:editId="1B148F57">
+                    <wp:anchor distT="4294967294" distB="4294967294" distL="114300" distR="114300" simplePos="0" relativeHeight="251672576" behindDoc="0" locked="0" layoutInCell="1" allowOverlap="1" wp14:anchorId="510C6537" wp14:editId="6393D64E">
                       <wp:simplePos x="0" y="0"/>
                       <wp:positionH relativeFrom="column">
                         <wp:posOffset>434340</wp:posOffset>
@@ -161,7 +161,7 @@
                     </wp:anchor>
                   </w:drawing>
                 </mc:Choice>
-                <mc:Fallback xmlns:cx1="http://schemas.microsoft.com/office/drawing/2015/9/8/chartex" xmlns:cx2="http://schemas.microsoft.com/office/drawing/2015/10/21/chartex" xmlns:cx3="http://schemas.microsoft.com/office/drawing/2016/5/9/chartex" xmlns:cx4="http://schemas.microsoft.com/office/drawing/2016/5/10/chartex" xmlns:cx5="http://schemas.microsoft.com/office/drawing/2016/5/11/chartex" xmlns:cx6="http://schemas.microsoft.com/office/drawing/2016/5/12/chartex" xmlns:cx7="http://schemas.microsoft.com/office/drawing/2016/5/13/chartex" xmlns:cx8="http://schemas.microsoft.com/office/drawing/2016/5/14/chartex" xmlns:aink="http://schemas.microsoft.com/office/drawing/2016/ink" xmlns:am3d="http://schemas.microsoft.com/office/drawing/2017/model3d" xmlns:oel="http://schemas.microsoft.com/office/2019/extlst" xmlns:w16cex="http://schemas.microsoft.com/office/word/2018/wordml/cex" xmlns:w16cid="http://schemas.microsoft.com/office/word/2016/wordml/cid" xmlns:w16="http://schemas.microsoft.com/office/word/2018/wordml" xmlns:w16du="http://schemas.microsoft.com/office/word/2023/wordml/word16du" xmlns:w16sdtdh="http://schemas.microsoft.com/office/word/2020/wordml/sdtdatahash">
+                <mc:Fallback xmlns:w16du="http://schemas.microsoft.com/office/word/2023/wordml/word16du" xmlns:oel="http://schemas.microsoft.com/office/2019/extlst">
                   <w:pict>
                     <v:line w14:anchorId="483CDAA2" id="Straight Connector 6" o:spid="_x0000_s1026" style="position:absolute;z-index:251672576;visibility:visible;mso-wrap-style:square;mso-width-percent:0;mso-height-percent:0;mso-wrap-distance-left:9pt;mso-wrap-distance-top:-6e-5mm;mso-wrap-distance-right:9pt;mso-wrap-distance-bottom:-6e-5mm;mso-position-horizontal:absolute;mso-position-horizontal-relative:text;mso-position-vertical:absolute;mso-position-vertical-relative:text;mso-width-percent:0;mso-height-percent:0;mso-width-relative:page;mso-height-relative:page" from="34.2pt,17.7pt" to="104.15pt,17.7pt" o:gfxdata="UEsDBBQABgAIAAAAIQC2gziS/gAAAOEBAAATAAAAW0NvbnRlbnRfVHlwZXNdLnhtbJSRQU7DMBBF 90jcwfIWJU67QAgl6YK0S0CoHGBkTxKLZGx5TGhvj5O2G0SRWNoz/78nu9wcxkFMGNg6quQqL6RA 0s5Y6ir5vt9lD1JwBDIwOMJKHpHlpr69KfdHjyxSmriSfYz+USnWPY7AufNIadK6MEJMx9ApD/oD OlTrorhX2lFEilmcO2RdNtjC5xDF9pCuTyYBB5bi6bQ4syoJ3g9WQ0ymaiLzg5KdCXlKLjvcW893 SUOqXwnz5DrgnHtJTxOsQfEKIT7DmDSUCaxw7Rqn8787ZsmRM9e2VmPeBN4uqYvTtW7jvijg9N/y JsXecLq0q+WD6m8AAAD//wMAUEsDBBQABgAIAAAAIQA4/SH/1gAAAJQBAAALAAAAX3JlbHMvLnJl bHOkkMFqwzAMhu+DvYPRfXGawxijTi+j0GvpHsDYimMaW0Yy2fr2M4PBMnrbUb/Q94l/f/hMi1qR JVI2sOt6UJgd+ZiDgffL8ekFlFSbvV0oo4EbChzGx4f9GRdb25HMsYhqlCwG5lrLq9biZkxWOiqY 22YiTra2kYMu1l1tQD30/bPm3wwYN0x18gb45AdQl1tp5j/sFB2T0FQ7R0nTNEV3j6o9feQzro1i OWA14Fm+Q8a1a8+Bvu/d/dMb2JY5uiPbhG/ktn4cqGU/er3pcvwCAAD//wMAUEsDBBQABgAIAAAA IQBrAbO7HAIAADUEAAAOAAAAZHJzL2Uyb0RvYy54bWysU02P2yAQvVfqf0DcE9vZJHWsOKvKTnrZ tpGy/QEEsI2KAQGJE1X97x3Ih7LtparqAx6YmcebN8Py+dRLdOTWCa1KnI1TjLiimgnVlvjb62aU Y+Q8UYxIrXiJz9zh59X7d8vBFHyiOy0ZtwhAlCsGU+LOe1MkiaMd74kba8MVOBtte+Jha9uEWTIA ei+TSZrOk0FbZqym3Dk4rS9OvIr4TcOp/9o0jnskSwzcfFxtXPdhTVZLUrSWmE7QKw3yDyx6IhRc eoeqiSfoYMUfUL2gVjvd+DHVfaKbRlAea4BqsvS3anYdMTzWAuI4c5fJ/T9Y+uW4tUiwEs8xUqSH Fu28JaLtPKq0UiCgtmgedBqMKyC8UlsbKqUntTMvmn53SOmqI6rlke/r2QBIFjKSNylh4wzcth8+ awYx5OB1FO3U2D5AghzoFHtzvveGnzyicJjn+dMcONKbKyHFLc9Y5z9x3aNglFgKFVQjBTm+OB94 kOIWEo6V3ggpY+elQkOJF7PJLCY4LQULzhDmbLuvpEVHEmYnfrEo8DyGWX1QLIJ1nLD11fZEyIsN l0sV8KASoHO1LsPxY5Eu1vk6n46mk/l6NE3revRxU01H8032YVY/1VVVZz8DtWxadIIxrgK726Bm 078bhOuTuYzYfVTvMiRv0aNeQPb2j6RjK0P3LnOw1+y8tbcWw2zG4Os7CsP/uAf78bWvfgEAAP// AwBQSwMEFAAGAAgAAAAhAH+y+bTcAAAACAEAAA8AAABkcnMvZG93bnJldi54bWxMj0FPwzAMhe9I /IfISFwmltLCVJWmEwJ648IAcfUa01Y0TtdkW+HXY8QBTpb9np6/V65nN6gDTaH3bOBymYAibrzt uTXw8lxf5KBCRLY4eCYDnxRgXZ2elFhYf+QnOmxiqySEQ4EGuhjHQuvQdOQwLP1ILNq7nxxGWadW 2wmPEu4GnSbJSjvsWT50ONJdR83HZu8MhPqVdvXXolkkb1nrKd3dPz6gMedn8+0NqEhz/DPDD76g QyVMW79nG9RgYJVfidNAdi1T9DTJM1Db34OuSv2/QPUNAAD//wMAUEsBAi0AFAAGAAgAAAAhALaD OJL+AAAA4QEAABMAAAAAAAAAAAAAAAAAAAAAAFtDb250ZW50X1R5cGVzXS54bWxQSwECLQAUAAYA CAAAACEAOP0h/9YAAACUAQAACwAAAAAAAAAAAAAAAAAvAQAAX3JlbHMvLnJlbHNQSwECLQAUAAYA CAAAACEAawGzuxwCAAA1BAAADgAAAAAAAAAAAAAAAAAuAgAAZHJzL2Uyb0RvYy54bWxQSwECLQAU AAYACAAAACEAf7L5tNwAAAAIAQAADwAAAAAAAAAAAAAAAAB2BAAAZHJzL2Rvd25yZXYueG1sUEsF BgAAAAAEAAQA8wAAAH8FAAAAAA== "/>
                   </w:pict>
@@ -205,7 +205,7 @@
               <mc:AlternateContent>
                 <mc:Choice Requires="wps">
                   <w:drawing>
-                    <wp:anchor distT="4294967294" distB="4294967294" distL="114300" distR="114300" simplePos="0" relativeHeight="251671552" behindDoc="0" locked="0" layoutInCell="1" allowOverlap="1" wp14:anchorId="3C683783" wp14:editId="6DEA5B2D">
+                    <wp:anchor distT="4294967294" distB="4294967294" distL="114300" distR="114300" simplePos="0" relativeHeight="251671552" behindDoc="0" locked="0" layoutInCell="1" allowOverlap="1" wp14:anchorId="39915AAF" wp14:editId="1850B814">
                       <wp:simplePos x="0" y="0"/>
                       <wp:positionH relativeFrom="column">
                         <wp:posOffset>777240</wp:posOffset>
@@ -264,7 +264,7 @@
                     </wp:anchor>
                   </w:drawing>
                 </mc:Choice>
-                <mc:Fallback xmlns:cx1="http://schemas.microsoft.com/office/drawing/2015/9/8/chartex" xmlns:cx2="http://schemas.microsoft.com/office/drawing/2015/10/21/chartex" xmlns:cx3="http://schemas.microsoft.com/office/drawing/2016/5/9/chartex" xmlns:cx4="http://schemas.microsoft.com/office/drawing/2016/5/10/chartex" xmlns:cx5="http://schemas.microsoft.com/office/drawing/2016/5/11/chartex" xmlns:cx6="http://schemas.microsoft.com/office/drawing/2016/5/12/chartex" xmlns:cx7="http://schemas.microsoft.com/office/drawing/2016/5/13/chartex" xmlns:cx8="http://schemas.microsoft.com/office/drawing/2016/5/14/chartex" xmlns:aink="http://schemas.microsoft.com/office/drawing/2016/ink" xmlns:am3d="http://schemas.microsoft.com/office/drawing/2017/model3d" xmlns:oel="http://schemas.microsoft.com/office/2019/extlst" xmlns:w16cex="http://schemas.microsoft.com/office/word/2018/wordml/cex" xmlns:w16cid="http://schemas.microsoft.com/office/word/2016/wordml/cid" xmlns:w16="http://schemas.microsoft.com/office/word/2018/wordml" xmlns:w16du="http://schemas.microsoft.com/office/word/2023/wordml/word16du" xmlns:w16sdtdh="http://schemas.microsoft.com/office/word/2020/wordml/sdtdatahash">
+                <mc:Fallback xmlns:w16du="http://schemas.microsoft.com/office/word/2023/wordml/word16du" xmlns:oel="http://schemas.microsoft.com/office/2019/extlst">
                   <w:pict>
                     <v:line w14:anchorId="669BF8CE" id="Straight Connector 3" o:spid="_x0000_s1026" style="position:absolute;flip:y;z-index:251671552;visibility:visible;mso-wrap-style:square;mso-width-percent:0;mso-height-percent:0;mso-wrap-distance-left:9pt;mso-wrap-distance-top:-6e-5mm;mso-wrap-distance-right:9pt;mso-wrap-distance-bottom:-6e-5mm;mso-position-horizontal:absolute;mso-position-horizontal-relative:text;mso-position-vertical:absolute;mso-position-vertical-relative:text;mso-width-percent:0;mso-height-percent:0;mso-width-relative:page;mso-height-relative:page" from="61.2pt,18.55pt" to="226.2pt,18.55pt" o:gfxdata="UEsDBBQABgAIAAAAIQC2gziS/gAAAOEBAAATAAAAW0NvbnRlbnRfVHlwZXNdLnhtbJSRQU7DMBBF 90jcwfIWJU67QAgl6YK0S0CoHGBkTxKLZGx5TGhvj5O2G0SRWNoz/78nu9wcxkFMGNg6quQqL6RA 0s5Y6ir5vt9lD1JwBDIwOMJKHpHlpr69KfdHjyxSmriSfYz+USnWPY7AufNIadK6MEJMx9ApD/oD OlTrorhX2lFEilmcO2RdNtjC5xDF9pCuTyYBB5bi6bQ4syoJ3g9WQ0ymaiLzg5KdCXlKLjvcW893 SUOqXwnz5DrgnHtJTxOsQfEKIT7DmDSUCaxw7Rqn8787ZsmRM9e2VmPeBN4uqYvTtW7jvijg9N/y JsXecLq0q+WD6m8AAAD//wMAUEsDBBQABgAIAAAAIQA4/SH/1gAAAJQBAAALAAAAX3JlbHMvLnJl bHOkkMFqwzAMhu+DvYPRfXGawxijTi+j0GvpHsDYimMaW0Yy2fr2M4PBMnrbUb/Q94l/f/hMi1qR JVI2sOt6UJgd+ZiDgffL8ekFlFSbvV0oo4EbChzGx4f9GRdb25HMsYhqlCwG5lrLq9biZkxWOiqY 22YiTra2kYMu1l1tQD30/bPm3wwYN0x18gb45AdQl1tp5j/sFB2T0FQ7R0nTNEV3j6o9feQzro1i OWA14Fm+Q8a1a8+Bvu/d/dMb2JY5uiPbhG/ktn4cqGU/er3pcvwCAAD//wMAUEsDBBQABgAIAAAA IQBV8nGhIwIAAEAEAAAOAAAAZHJzL2Uyb0RvYy54bWysU8uu2yAQ3VfqPyD2ie28mlhxrio76ea2 jZTb7glgGxUDAhInqvrvHcijue2mquoFHpiZw5kzw/Lp1El05NYJrQqcDVOMuKKaCdUU+MvLZjDH yHmiGJFa8QKfucNPq7dvlr3J+Ui3WjJuEYAol/emwK33Jk8SR1veETfUhitw1tp2xMPWNgmzpAf0 TiajNJ0lvbbMWE25c3BaXZx4FfHrmlP/ua4d90gWGLj5uNq47sOarJYkbywxraBXGuQfWHREKLj0 DlURT9DBij+gOkGtdrr2Q6q7RNe1oDzWANVk6W/V7FpieKwFxHHmLpP7f7D003FrkWAFHmOkSAct 2nlLRNN6VGqlQEBt0Tjo1BuXQ3iptjZUSk9qZ541/eaQ0mVLVMMj35ezAZAsZCSvUsLGGbht33/U DGLIweso2qm2HaqlMF9DYgAHYdApdul87xI/eUThcJQuptMUmklvvoTkASIkGuv8B647FIwCS6GC gCQnx2fnA6VfIeFY6Y2QMg6BVKgv8GI6msYEp6VgwRnCnG32pbToSMIYxS/WB57HMKsPikWwlhO2 vtqeCHmx4XKpAh6UAnSu1mVOvi/SxXq+nk8Gk9FsPZikVTV4vykng9kmezetxlVZVtmPQC2b5K1g jKvA7jaz2eTvZuL6ei7Tdp/auwzJa/SoF5C9/SPp2NXQyMtI7DU7b+2t2zCmMfj6pMI7eNyD/fjw Vz8BAAD//wMAUEsDBBQABgAIAAAAIQBVuYJa3AAAAAkBAAAPAAAAZHJzL2Rvd25yZXYueG1sTI/N TsMwEITvSLyDtZW4Uadp+Wkap6oQcEFCogTOTrxNIux1FLtpeHu24gDHmf00O5NvJ2fFiEPoPClY zBMQSLU3HTUKyven63sQIWoy2npCBd8YYFtcXuQ6M/5EbzjuYyM4hEKmFbQx9pmUoW7R6TD3PRLf Dn5wOrIcGmkGfeJwZ2WaJLfS6Y74Q6t7fGix/tofnYLd58vj8nWsnLdm3ZQfxpXJc6rU1WzabUBE nOIfDOf6XB0K7lT5I5kgLOs0XTGqYHm3AMHA6uZsVL+GLHL5f0HxAwAA//8DAFBLAQItABQABgAI AAAAIQC2gziS/gAAAOEBAAATAAAAAAAAAAAAAAAAAAAAAABbQ29udGVudF9UeXBlc10ueG1sUEsB Ai0AFAAGAAgAAAAhADj9If/WAAAAlAEAAAsAAAAAAAAAAAAAAAAALwEAAF9yZWxzLy5yZWxzUEsB Ai0AFAAGAAgAAAAhAFXycaEjAgAAQAQAAA4AAAAAAAAAAAAAAAAALgIAAGRycy9lMm9Eb2MueG1s UEsBAi0AFAAGAAgAAAAhAFW5glrcAAAACQEAAA8AAAAAAAAAAAAAAAAAfQQAAGRycy9kb3ducmV2 LnhtbFBLBQYAAAAABAAEAPMAAACGBQAAAAA= "/>
                   </w:pict>
@@ -306,8 +306,8 @@
               <w:rPr>
                 <w:rFonts w:ascii="Times New Roman" w:hAnsi="Times New Roman"/>
                 <w:bCs/>
+                <w:sz w:val="26"/>
                 <w:szCs w:val="26"/>
-                <w:sz w:val="26"/>
               </w:rPr>
               <w:t>Số:</w:t>
             </w:r>
@@ -315,18 +315,36 @@
               <w:rPr>
                 <w:rFonts w:ascii="Times New Roman" w:hAnsi="Times New Roman"/>
                 <w:b/>
+                <w:sz w:val="26"/>
                 <w:szCs w:val="26"/>
+              </w:rPr>
+              <w:t xml:space="preserve">        </w:t>
+            </w:r>
+            <w:r>
+              <w:rPr>
+                <w:rFonts w:ascii="Times New Roman" w:hAnsi="Times New Roman"/>
+                <w:b/>
                 <w:sz w:val="26"/>
-              </w:rPr>
-              <w:t xml:space="preserve">            </w:t>
+                <w:szCs w:val="26"/>
+              </w:rPr>
+              <w:t xml:space="preserve">  </w:t>
+            </w:r>
+            <w:r>
+              <w:rPr>
+                <w:rFonts w:ascii="Times New Roman" w:hAnsi="Times New Roman"/>
+                <w:b/>
+                <w:sz w:val="26"/>
+                <w:szCs w:val="26"/>
+              </w:rPr>
+              <w:t xml:space="preserve">    </w:t>
             </w:r>
             <w:r>
               <w:rPr>
                 <w:rFonts w:ascii="Times New Roman" w:hAnsi="Times New Roman"/>
                 <w:b/>
                 <w:bCs/>
+                <w:sz w:val="26"/>
                 <w:szCs w:val="26"/>
-                <w:sz w:val="26"/>
               </w:rPr>
               <w:t>/</w:t>
             </w:r>
@@ -334,8 +352,8 @@
               <w:rPr>
                 <w:rFonts w:ascii="Times New Roman" w:hAnsi="Times New Roman"/>
                 <w:bCs/>
+                <w:sz w:val="26"/>
                 <w:szCs w:val="26"/>
-                <w:sz w:val="26"/>
               </w:rPr>
               <w:t>GP - SCT</w:t>
             </w:r>
@@ -435,7 +453,7 @@
         <mc:AlternateContent>
           <mc:Choice Requires="wps">
             <w:drawing>
-              <wp:anchor distT="4294967294" distB="4294967294" distL="114300" distR="114300" simplePos="0" relativeHeight="251664384" behindDoc="0" locked="0" layoutInCell="1" allowOverlap="1" wp14:anchorId="2AEF840A" wp14:editId="4DBA6BCD">
+              <wp:anchor distT="4294967294" distB="4294967294" distL="114300" distR="114300" simplePos="0" relativeHeight="251664384" behindDoc="0" locked="0" layoutInCell="1" allowOverlap="1" wp14:anchorId="6BB29C33" wp14:editId="3E1F2E90">
                 <wp:simplePos x="0" y="0"/>
                 <wp:positionH relativeFrom="column">
                   <wp:posOffset>2197735</wp:posOffset>
@@ -494,7 +512,7 @@
               </wp:anchor>
             </w:drawing>
           </mc:Choice>
-          <mc:Fallback xmlns:cx1="http://schemas.microsoft.com/office/drawing/2015/9/8/chartex" xmlns:cx2="http://schemas.microsoft.com/office/drawing/2015/10/21/chartex" xmlns:cx3="http://schemas.microsoft.com/office/drawing/2016/5/9/chartex" xmlns:cx4="http://schemas.microsoft.com/office/drawing/2016/5/10/chartex" xmlns:cx5="http://schemas.microsoft.com/office/drawing/2016/5/11/chartex" xmlns:cx6="http://schemas.microsoft.com/office/drawing/2016/5/12/chartex" xmlns:cx7="http://schemas.microsoft.com/office/drawing/2016/5/13/chartex" xmlns:cx8="http://schemas.microsoft.com/office/drawing/2016/5/14/chartex" xmlns:aink="http://schemas.microsoft.com/office/drawing/2016/ink" xmlns:am3d="http://schemas.microsoft.com/office/drawing/2017/model3d" xmlns:oel="http://schemas.microsoft.com/office/2019/extlst" xmlns:w16cex="http://schemas.microsoft.com/office/word/2018/wordml/cex" xmlns:w16cid="http://schemas.microsoft.com/office/word/2016/wordml/cid" xmlns:w16="http://schemas.microsoft.com/office/word/2018/wordml" xmlns:w16du="http://schemas.microsoft.com/office/word/2023/wordml/word16du" xmlns:w16sdtdh="http://schemas.microsoft.com/office/word/2020/wordml/sdtdatahash" xmlns:w16sdtfl="http://schemas.microsoft.com/office/word/2024/wordml/sdtformatlock">
+          <mc:Fallback xmlns:w16sdtfl="http://schemas.microsoft.com/office/word/2024/wordml/sdtformatlock" xmlns:w16du="http://schemas.microsoft.com/office/word/2023/wordml/word16du" xmlns:oel="http://schemas.microsoft.com/office/2019/extlst">
             <w:pict>
               <v:line w14:anchorId="11BA79E5" id="Line 10" o:spid="_x0000_s1026" style="position:absolute;z-index:251664384;visibility:visible;mso-wrap-style:square;mso-width-percent:0;mso-height-percent:0;mso-wrap-distance-left:9pt;mso-wrap-distance-top:-6e-5mm;mso-wrap-distance-right:9pt;mso-wrap-distance-bottom:-6e-5mm;mso-position-horizontal:absolute;mso-position-horizontal-relative:text;mso-position-vertical:absolute;mso-position-vertical-relative:text;mso-width-percent:0;mso-height-percent:0;mso-width-relative:page;mso-height-relative:page" from="173.05pt,4.65pt" to="276.55pt,4.65pt" o:gfxdata="UEsDBBQABgAIAAAAIQC2gziS/gAAAOEBAAATAAAAW0NvbnRlbnRfVHlwZXNdLnhtbJSRQU7DMBBF 90jcwfIWJU67QAgl6YK0S0CoHGBkTxKLZGx5TGhvj5O2G0SRWNoz/78nu9wcxkFMGNg6quQqL6RA 0s5Y6ir5vt9lD1JwBDIwOMJKHpHlpr69KfdHjyxSmriSfYz+USnWPY7AufNIadK6MEJMx9ApD/oD OlTrorhX2lFEilmcO2RdNtjC5xDF9pCuTyYBB5bi6bQ4syoJ3g9WQ0ymaiLzg5KdCXlKLjvcW893 SUOqXwnz5DrgnHtJTxOsQfEKIT7DmDSUCaxw7Rqn8787ZsmRM9e2VmPeBN4uqYvTtW7jvijg9N/y JsXecLq0q+WD6m8AAAD//wMAUEsDBBQABgAIAAAAIQA4/SH/1gAAAJQBAAALAAAAX3JlbHMvLnJl bHOkkMFqwzAMhu+DvYPRfXGawxijTi+j0GvpHsDYimMaW0Yy2fr2M4PBMnrbUb/Q94l/f/hMi1qR JVI2sOt6UJgd+ZiDgffL8ekFlFSbvV0oo4EbChzGx4f9GRdb25HMsYhqlCwG5lrLq9biZkxWOiqY 22YiTra2kYMu1l1tQD30/bPm3wwYN0x18gb45AdQl1tp5j/sFB2T0FQ7R0nTNEV3j6o9feQzro1i OWA14Fm+Q8a1a8+Bvu/d/dMb2JY5uiPbhG/ktn4cqGU/er3pcvwCAAD//wMAUEsDBBQABgAIAAAA IQCOZM6EEwIAACkEAAAOAAAAZHJzL2Uyb0RvYy54bWysU8GO2jAQvVfqP1i+QxI2UIgIqyqBXmiL tNsPMLZDrDq2ZRsCqvrvHRuC2PZSVc3BGXvGz2/mzSyfz51EJ26d0KrE2TjFiCuqmVCHEn973Yzm GDlPFCNSK17iC3f4efX+3bI3BZ/oVkvGLQIQ5YrelLj13hRJ4mjLO+LG2nAFzkbbjnjY2kPCLOkB vZPJJE1nSa8tM1ZT7hyc1lcnXkX8puHUf20axz2SJQZuPq42rvuwJqslKQ6WmFbQGw3yDyw6IhQ8 eoeqiSfoaMUfUJ2gVjvd+DHVXaKbRlAec4BssvS3bF5aYnjMBYrjzL1M7v/B0i+nnUWClTjHSJEO JNoKxVEWS9MbV0BEpXY2JEfP6sVsNf3ukNJVS9SBR4qvFwP3slDM5M2VsHEGHtj3nzWDGHL0Otbp 3NguQEIF0DnKcbnLwc8eUTjMnrI8n4JqdPAlpBguGuv8J647FIwSSyAdgclp63wgQoohJLyj9EZI GdWWCvUlXkwn03jBaSlYcIYwZw/7Slp0IqFf4hezAs9jmNVHxSJYywlb32xPhLza8LhUAQ9SATo3 69oQPxbpYj1fz/NRPpmtR3la16OPmyofzTbZh2n9VFdVnf0M1LK8aAVjXAV2Q3Nm+d+JfxuTa1vd 2/NehuQteqwXkB3+kXTUMsgXpskVe80uOztoDP0Yg2+zExr+cQ/244SvfgEAAP//AwBQSwMEFAAG AAgAAAAhACpmV+PbAAAABwEAAA8AAABkcnMvZG93bnJldi54bWxMjsFOwzAQRO9I/IO1SFyq1mlD KwhxKgTkxoVSxHUbL0lEvE5jtw18PQsXOD7NaObl69F16khDaD0bmM8SUMSVty3XBrYv5fQaVIjI FjvPZOCTAqyL87McM+tP/EzHTayVjHDI0EATY59pHaqGHIaZ74kle/eDwyg41NoOeJJx1+lFkqy0 w5blocGe7huqPjYHZyCUr7QvvybVJHlLa0+L/cPTIxpzeTHe3YKKNMa/MvzoizoU4rTzB7ZBdQbS q9VcqgZuUlCSL5ep8O6XdZHr//7FNwAAAP//AwBQSwECLQAUAAYACAAAACEAtoM4kv4AAADhAQAA EwAAAAAAAAAAAAAAAAAAAAAAW0NvbnRlbnRfVHlwZXNdLnhtbFBLAQItABQABgAIAAAAIQA4/SH/ 1gAAAJQBAAALAAAAAAAAAAAAAAAAAC8BAABfcmVscy8ucmVsc1BLAQItABQABgAIAAAAIQCOZM6E EwIAACkEAAAOAAAAAAAAAAAAAAAAAC4CAABkcnMvZTJvRG9jLnhtbFBLAQItABQABgAIAAAAIQAq Zlfj2wAAAAcBAAAPAAAAAAAAAAAAAAAAAG0EAABkcnMvZG93bnJldi54bWxQSwUGAAAAAAQABADz AAAAdQUAAAAA "/>
             </w:pict>
@@ -541,6 +559,7 @@
         <w:jc w:val="center"/>
         <w:rPr>
           <w:rFonts w:ascii="Times New Roman" w:hAnsi="Times New Roman"/>
+          <w:szCs w:val="28"/>
         </w:rPr>
       </w:pPr>
       <w:r>
@@ -626,7 +645,21 @@
           <w:rFonts w:ascii="Times New Roman" w:hAnsi="Times New Roman"/>
           <w:szCs w:val="28"/>
         </w:rPr>
-        <w:t>Giấy chứng nhận đăng ký hoạt động chi nhánh mã số: 0106092522-001 do Phòng Doanh nghiệp - Sở Tài chính tỉnh Lào Cai cấp, đăng ký lần đầu ngày 27/6/2026; hoạt động the</w:t>
+        <w:t>Giấ</w:t>
+      </w:r>
+      <w:r>
+        <w:rPr>
+          <w:rFonts w:ascii="Times New Roman" w:hAnsi="Times New Roman"/>
+          <w:szCs w:val="28"/>
+        </w:rPr>
+        <w:t>y chứng nhận đăng ký hoạt động c</w:t>
+      </w:r>
+      <w:r>
+        <w:rPr>
+          <w:rFonts w:ascii="Times New Roman" w:hAnsi="Times New Roman"/>
+          <w:szCs w:val="28"/>
+        </w:rPr>
+        <w:t>hi nhánh mã số: 0106092522-001 do Phòng Doanh nghiệp - Sở Tài chính tỉnh Lào Cai cấp, đăng ký lần đầu ngày 27/6/2026; hoạt động the</w:t>
       </w:r>
       <w:r>
         <w:rPr>
@@ -695,7 +728,21 @@
           <w:rFonts w:ascii="Times New Roman" w:hAnsi="Times New Roman"/>
           <w:szCs w:val="28"/>
         </w:rPr>
-        <w:t>Được phép vận chuyển hàng hóa nguy hiểm: khí Argon, chất lỏng làm lạnh (số hiệu UN 1951, loại 2, số hiệu nguy hiểm 22); Chi nhánh số 1 - Công ty cổ phần Xuất nhập khẩu Sợi Phương Nam phải có trách nhiệm duy trì các điều kiện an toàn về vận chuyển hàng hóa nguy hiểm của phương tiện, bố trí người áp tải và chấp hành đầy đủ các quy định về hàng hóa nguy hiểm trong suốt quá trình vận chuyển (Danh mục kèm theo Giấy phép này).</w:t>
+        <w:t xml:space="preserve">Được phép </w:t>
+      </w:r>
+      <w:r>
+        <w:rPr>
+          <w:rFonts w:ascii="Times New Roman" w:hAnsi="Times New Roman"/>
+          <w:szCs w:val="28"/>
+        </w:rPr>
+        <w:t>vận chuyển hàng hóa nguy hiểm: k</w:t>
+      </w:r>
+      <w:r>
+        <w:rPr>
+          <w:rFonts w:ascii="Times New Roman" w:hAnsi="Times New Roman"/>
+          <w:szCs w:val="28"/>
+        </w:rPr>
+        <w:t>hí Argon, chất lỏng làm lạnh (số hiệu UN 1951, loại 2, số hiệu nguy hiểm 22); Chi nhánh số 1 - Công ty cổ phần Xuất nhập khẩu Sợi Phương Nam phải có trách nhiệm duy trì các điều kiện an toàn về vận chuyển hàng hóa nguy hiểm của phương tiện, bố trí người áp tải và chấp hành đầy đủ các quy định về hàng hóa nguy hiểm trong suốt quá trình vận chuyển (Danh mục kèm theo Giấy phép này).</w:t>
       </w:r>
     </w:p>
     <w:p>
@@ -713,13 +760,7 @@
           <w:rFonts w:ascii="Times New Roman" w:hAnsi="Times New Roman"/>
           <w:szCs w:val="28"/>
         </w:rPr>
-        <w:t>Thời hạn của Giấy phép: 24 tháng kể từ ngày ký nhưng không vượt quá ngày 23/8/2028./.</w:t>
-      </w:r>
-      <w:r>
-        <w:rPr>
-          <w:rFonts w:ascii="Times New Roman" w:hAnsi="Times New Roman"/>
-          <w:szCs w:val="28"/>
-        </w:rPr>
+        <w:t>Thời hạn của Giấy phép: 24 tháng kể từ ngày ký./.</w:t>
       </w:r>
     </w:p>
     <w:p>
@@ -757,8 +798,8 @@
       </w:tblGrid>
       <w:tr>
         <w:trPr>
+          <w:cantSplit/>
           <w:jc w:val="center"/>
-          <w:cantSplit/>
         </w:trPr>
         <w:tc>
           <w:tcPr>
@@ -1278,7 +1319,7 @@
         <mc:AlternateContent>
           <mc:Choice Requires="wps">
             <w:drawing>
-              <wp:anchor distT="0" distB="0" distL="114300" distR="114300" simplePos="0" relativeHeight="251666432" behindDoc="0" locked="0" layoutInCell="1" allowOverlap="1" wp14:anchorId="43C6F6CE" wp14:editId="72DDA521">
+              <wp:anchor distT="0" distB="0" distL="114300" distR="114300" simplePos="0" relativeHeight="251666432" behindDoc="0" locked="0" layoutInCell="1" allowOverlap="1" wp14:anchorId="4D4A22A7" wp14:editId="3020406D">
                 <wp:simplePos x="0" y="0"/>
                 <wp:positionH relativeFrom="margin">
                   <wp:posOffset>2232025</wp:posOffset>
@@ -1328,7 +1369,7 @@
               </wp:anchor>
             </w:drawing>
           </mc:Choice>
-          <mc:Fallback xmlns:cx1="http://schemas.microsoft.com/office/drawing/2015/9/8/chartex" xmlns:cx2="http://schemas.microsoft.com/office/drawing/2015/10/21/chartex" xmlns:cx3="http://schemas.microsoft.com/office/drawing/2016/5/9/chartex" xmlns:cx4="http://schemas.microsoft.com/office/drawing/2016/5/10/chartex" xmlns:cx5="http://schemas.microsoft.com/office/drawing/2016/5/11/chartex" xmlns:cx6="http://schemas.microsoft.com/office/drawing/2016/5/12/chartex" xmlns:cx7="http://schemas.microsoft.com/office/drawing/2016/5/13/chartex" xmlns:cx8="http://schemas.microsoft.com/office/drawing/2016/5/14/chartex" xmlns:aink="http://schemas.microsoft.com/office/drawing/2016/ink" xmlns:am3d="http://schemas.microsoft.com/office/drawing/2017/model3d" xmlns:oel="http://schemas.microsoft.com/office/2019/extlst" xmlns:w16cex="http://schemas.microsoft.com/office/word/2018/wordml/cex" xmlns:w16cid="http://schemas.microsoft.com/office/word/2016/wordml/cid" xmlns:w16="http://schemas.microsoft.com/office/word/2018/wordml" xmlns:w16du="http://schemas.microsoft.com/office/word/2023/wordml/word16du" xmlns:w16sdtdh="http://schemas.microsoft.com/office/word/2020/wordml/sdtdatahash" xmlns:w16sdtfl="http://schemas.microsoft.com/office/word/2024/wordml/sdtformatlock">
+          <mc:Fallback xmlns:w16sdtfl="http://schemas.microsoft.com/office/word/2024/wordml/sdtformatlock" xmlns:w16du="http://schemas.microsoft.com/office/word/2023/wordml/word16du" xmlns:oel="http://schemas.microsoft.com/office/2019/extlst">
             <w:pict>
               <v:line w14:anchorId="592F0BDA" id="Straight Connector 5" o:spid="_x0000_s1026" style="position:absolute;z-index:251666432;visibility:visible;mso-wrap-style:square;mso-width-percent:0;mso-wrap-distance-left:9pt;mso-wrap-distance-top:0;mso-wrap-distance-right:9pt;mso-wrap-distance-bottom:0;mso-position-horizontal:absolute;mso-position-horizontal-relative:margin;mso-position-vertical:absolute;mso-position-vertical-relative:text;mso-width-percent:0;mso-width-relative:margin" from="175.75pt,2.3pt" to="276.25pt,2.3pt" o:gfxdata="UEsDBBQABgAIAAAAIQC2gziS/gAAAOEBAAATAAAAW0NvbnRlbnRfVHlwZXNdLnhtbJSRQU7DMBBF 90jcwfIWJU67QAgl6YK0S0CoHGBkTxKLZGx5TGhvj5O2G0SRWNoz/78nu9wcxkFMGNg6quQqL6RA 0s5Y6ir5vt9lD1JwBDIwOMJKHpHlpr69KfdHjyxSmriSfYz+USnWPY7AufNIadK6MEJMx9ApD/oD OlTrorhX2lFEilmcO2RdNtjC5xDF9pCuTyYBB5bi6bQ4syoJ3g9WQ0ymaiLzg5KdCXlKLjvcW893 SUOqXwnz5DrgnHtJTxOsQfEKIT7DmDSUCaxw7Rqn8787ZsmRM9e2VmPeBN4uqYvTtW7jvijg9N/y JsXecLq0q+WD6m8AAAD//wMAUEsDBBQABgAIAAAAIQA4/SH/1gAAAJQBAAALAAAAX3JlbHMvLnJl bHOkkMFqwzAMhu+DvYPRfXGawxijTi+j0GvpHsDYimMaW0Yy2fr2M4PBMnrbUb/Q94l/f/hMi1qR JVI2sOt6UJgd+ZiDgffL8ekFlFSbvV0oo4EbChzGx4f9GRdb25HMsYhqlCwG5lrLq9biZkxWOiqY 22YiTra2kYMu1l1tQD30/bPm3wwYN0x18gb45AdQl1tp5j/sFB2T0FQ7R0nTNEV3j6o9feQzro1i OWA14Fm+Q8a1a8+Bvu/d/dMb2JY5uiPbhG/ktn4cqGU/er3pcvwCAAD//wMAUEsDBBQABgAIAAAA IQCr0hbdtQEAALcDAAAOAAAAZHJzL2Uyb0RvYy54bWysU8GOEzEMvSPxD1HudNqiLmjU6R66gguC imU/IJtxOhFJHDmh0/49TtrOIkAIrfbiiZP3bD/bs749eicOQMli6ORiNpcCgsbehn0nH759ePNe ipRV6JXDAJ08QZK3m9ev1mNsYYkDuh5IcJCQ2jF2csg5tk2T9ABepRlGCPxokLzK7NK+6UmNHN27 Zjmf3zQjUh8JNaTEt3fnR7mp8Y0Bnb8YkyAL10muLVdL1T4W22zWqt2TioPVlzLUM6rwygZOOoW6 U1mJH2T/COWtJkxo8kyjb9AYq6FqYDWL+W9q7gcVoWrh5qQ4tSm9XFj9+bAjYftOrqQIyvOI7jMp ux+y2GII3EAksSp9GmNqGb4NO7p4Ke6oiD4a8uXLcsSx9vY09RaOWWi+XCzf3bxd8Qj09a15IkZK +SOgF+XQSWdDka1adfiUMidj6BXCTinknLqe8slBAbvwFQxLKckquy4RbB2Jg+Lx998XRQbHqshC Mda5iTT/N+mCLTSoi/W/xAldM2LIE9HbgPS3rPl4LdWc8VfVZ61F9iP2pzqI2g7ejqrsssll/X71 K/3pf9v8BAAA//8DAFBLAwQUAAYACAAAACEAAWFi/doAAAAHAQAADwAAAGRycy9kb3ducmV2Lnht bEyOwU7DMBBE70j8g7VI3KjTQCIU4lRVJYS4IJrC3Y23TsBeR7aThr/HcIHj04xmXr1ZrGEz+jA4 ErBeZcCQOqcG0gLeDo8398BClKSkcYQCvjDAprm8qGWl3Jn2OLdRszRCoZIC+hjHivPQ9WhlWLkR KWUn562MCb3mystzGreG51lWcisHSg+9HHHXY/fZTlaAefbzu97pbZie9mX78XrKXw6zENdXy/YB WMQl/pXhRz+pQ5Ocjm4iFZgRcFusi1QVcFcCS3lR5ImPv8ybmv/3b74BAAD//wMAUEsBAi0AFAAG AAgAAAAhALaDOJL+AAAA4QEAABMAAAAAAAAAAAAAAAAAAAAAAFtDb250ZW50X1R5cGVzXS54bWxQ SwECLQAUAAYACAAAACEAOP0h/9YAAACUAQAACwAAAAAAAAAAAAAAAAAvAQAAX3JlbHMvLnJlbHNQ SwECLQAUAAYACAAAACEAq9IW3bUBAAC3AwAADgAAAAAAAAAAAAAAAAAuAgAAZHJzL2Uyb0RvYy54 bWxQSwECLQAUAAYACAAAACEAAWFi/doAAAAHAQAADwAAAAAAAAAAAAAAAAAPBAAAZHJzL2Rvd25y ZXYueG1sUEsFBgAAAAAEAAQA8wAAABYFAAAAAA== " strokecolor="black [3200]" strokeweight=".5pt">
                 <v:stroke joinstyle="miter"/>
@@ -1752,7 +1793,7 @@
     </w:p>
     <w:tbl>
       <w:tblPr>
-        <w:tblW w:w="9072" w:type="dxa"/>
+        <w:tblW w:w="9085" w:type="dxa"/>
         <w:tblBorders>
           <w:top w:val="single" w:sz="4" w:space="0" w:color="000000"/>
           <w:left w:val="single" w:sz="4" w:space="0" w:color="000000"/>
@@ -1764,9 +1805,9 @@
         <w:tblLook w:val="04A0" w:firstRow="1" w:lastRow="0" w:firstColumn="1" w:lastColumn="0" w:noHBand="0" w:noVBand="1"/>
       </w:tblPr>
       <w:tblGrid>
-        <w:gridCol w:w="680"/>
-        <w:gridCol w:w="6011"/>
-        <w:gridCol w:w="2381"/>
+        <w:gridCol w:w="681"/>
+        <w:gridCol w:w="6020"/>
+        <w:gridCol w:w="2384"/>
       </w:tblGrid>
       <w:tr>
         <w:trPr>
@@ -1774,7 +1815,7 @@
         </w:trPr>
         <w:tc>
           <w:tcPr>
-            <w:tcW w:w="680" w:type="dxa"/>
+            <w:tcW w:w="681" w:type="dxa"/>
             <w:vAlign w:val="center"/>
           </w:tcPr>
           <w:p>
@@ -1794,7 +1835,7 @@
         </w:tc>
         <w:tc>
           <w:tcPr>
-            <w:tcW w:w="6010" w:type="dxa"/>
+            <w:tcW w:w="6020" w:type="dxa"/>
             <w:vAlign w:val="center"/>
           </w:tcPr>
           <w:p>
@@ -1814,7 +1855,7 @@
         </w:tc>
         <w:tc>
           <w:tcPr>
-            <w:tcW w:w="2381" w:type="dxa"/>
+            <w:tcW w:w="2384" w:type="dxa"/>
             <w:vAlign w:val="center"/>
           </w:tcPr>
           <w:p>
@@ -1828,7 +1869,7 @@
                 <w:b/>
                 <w:sz w:val="26"/>
               </w:rPr>
-              <w:t>Trọng tải được phép chở/khối lượng kéo theo (kg)</w:t>
+              <w:t>Trọng tải được phép chở</w:t>
             </w:r>
           </w:p>
         </w:tc>
@@ -1836,7 +1877,7 @@
       <w:tr>
         <w:tc>
           <w:tcPr>
-            <w:tcW w:w="680" w:type="dxa"/>
+            <w:tcW w:w="681" w:type="dxa"/>
             <w:vAlign w:val="center"/>
           </w:tcPr>
           <w:p>
@@ -1855,7 +1896,7 @@
         </w:tc>
         <w:tc>
           <w:tcPr>
-            <w:tcW w:w="6010" w:type="dxa"/>
+            <w:tcW w:w="6020" w:type="dxa"/>
             <w:vAlign w:val="center"/>
           </w:tcPr>
           <w:p>
@@ -1874,7 +1915,8 @@
         </w:tc>
         <w:tc>
           <w:tcPr>
-            <w:tcW w:w="2381" w:type="dxa"/>
+            <w:tcW w:w="2384" w:type="dxa"/>
+            <w:vMerge w:val="restart"/>
             <w:vAlign w:val="center"/>
           </w:tcPr>
           <w:p>
@@ -1887,7 +1929,7 @@
                 <w:rFonts w:ascii="Times New Roman" w:hAnsi="Times New Roman"/>
                 <w:sz w:val="26"/>
               </w:rPr>
-              <w:t>25.000 (khối lượng kéo theo)</w:t>
+              <w:t>Theo giấy tờ của phương tiện</w:t>
             </w:r>
           </w:p>
         </w:tc>
@@ -1895,7 +1937,7 @@
       <w:tr>
         <w:tc>
           <w:tcPr>
-            <w:tcW w:w="680" w:type="dxa"/>
+            <w:tcW w:w="681" w:type="dxa"/>
             <w:vAlign w:val="center"/>
           </w:tcPr>
           <w:p>
@@ -1914,7 +1956,7 @@
         </w:tc>
         <w:tc>
           <w:tcPr>
-            <w:tcW w:w="6010" w:type="dxa"/>
+            <w:tcW w:w="6020" w:type="dxa"/>
             <w:vAlign w:val="center"/>
           </w:tcPr>
           <w:p>
@@ -1940,13 +1982,22 @@
                 <w:rFonts w:ascii="Times New Roman" w:hAnsi="Times New Roman"/>
                 <w:sz w:val="26"/>
               </w:rPr>
-              <w:t>Dung tích bồn: 22,3m3</w:t>
+              <w:t>Dung tích bồn: 22,3m</w:t>
+            </w:r>
+            <w:r>
+              <w:rPr>
+                <w:rFonts w:ascii="Times New Roman" w:hAnsi="Times New Roman"/>
+                <w:sz w:val="26"/>
+                <w:vertAlign w:val="superscript"/>
+              </w:rPr>
+              <w:t>3</w:t>
             </w:r>
           </w:p>
         </w:tc>
         <w:tc>
           <w:tcPr>
-            <w:tcW w:w="2381" w:type="dxa"/>
+            <w:tcW w:w="2384" w:type="dxa"/>
+            <w:vMerge/>
             <w:vAlign w:val="center"/>
           </w:tcPr>
           <w:p>
@@ -1954,13 +2005,6 @@
               <w:spacing w:before="40" w:after="40"/>
               <w:jc w:val="center"/>
             </w:pPr>
-            <w:r>
-              <w:rPr>
-                <w:rFonts w:ascii="Times New Roman" w:hAnsi="Times New Roman"/>
-                <w:sz w:val="26"/>
-              </w:rPr>
-              <w:t>28.315</w:t>
-            </w:r>
           </w:p>
         </w:tc>
       </w:tr>
@@ -1979,7 +2023,7 @@
 </file>
 
 <file path=word/endnotes.xml><?xml version="1.0" encoding="utf-8"?>
-<w:endnotes xmlns:wpc="http://schemas.microsoft.com/office/word/2010/wordprocessingCanvas" xmlns:cx="http://schemas.microsoft.com/office/drawing/2014/chartex" xmlns:mc="http://schemas.openxmlformats.org/markup-compatibility/2006" xmlns:o="urn:schemas-microsoft-com:office:office" xmlns:r="http://schemas.openxmlformats.org/officeDocument/2006/relationships" xmlns:m="http://schemas.openxmlformats.org/officeDocument/2006/math" xmlns:v="urn:schemas-microsoft-com:vml" xmlns:wp14="http://schemas.microsoft.com/office/word/2010/wordprocessingDrawing" xmlns:wp="http://schemas.openxmlformats.org/drawingml/2006/wordprocessingDrawing" xmlns:w10="urn:schemas-microsoft-com:office:word" xmlns:w="http://schemas.openxmlformats.org/wordprocessingml/2006/main" xmlns:w14="http://schemas.microsoft.com/office/word/2010/wordml" xmlns:w15="http://schemas.microsoft.com/office/word/2012/wordml" xmlns:w16se="http://schemas.microsoft.com/office/word/2015/wordml/symex" xmlns:wpg="http://schemas.microsoft.com/office/word/2010/wordprocessingGroup" xmlns:wpi="http://schemas.microsoft.com/office/word/2010/wordprocessingInk" xmlns:wne="http://schemas.microsoft.com/office/word/2006/wordml" xmlns:wps="http://schemas.microsoft.com/office/word/2010/wordprocessingShape" mc:Ignorable="w14 w15 w16se wp14">
+<w:endnotes xmlns:wpc="http://schemas.microsoft.com/office/word/2010/wordprocessingCanvas" xmlns:cx="http://schemas.microsoft.com/office/drawing/2014/chartex" xmlns:cx1="http://schemas.microsoft.com/office/drawing/2015/9/8/chartex" xmlns:cx2="http://schemas.microsoft.com/office/drawing/2015/10/21/chartex" xmlns:cx3="http://schemas.microsoft.com/office/drawing/2016/5/9/chartex" xmlns:cx4="http://schemas.microsoft.com/office/drawing/2016/5/10/chartex" xmlns:cx5="http://schemas.microsoft.com/office/drawing/2016/5/11/chartex" xmlns:cx6="http://schemas.microsoft.com/office/drawing/2016/5/12/chartex" xmlns:cx7="http://schemas.microsoft.com/office/drawing/2016/5/13/chartex" xmlns:cx8="http://schemas.microsoft.com/office/drawing/2016/5/14/chartex" xmlns:mc="http://schemas.openxmlformats.org/markup-compatibility/2006" xmlns:aink="http://schemas.microsoft.com/office/drawing/2016/ink" xmlns:am3d="http://schemas.microsoft.com/office/drawing/2017/model3d" xmlns:o="urn:schemas-microsoft-com:office:office" xmlns:r="http://schemas.openxmlformats.org/officeDocument/2006/relationships" xmlns:m="http://schemas.openxmlformats.org/officeDocument/2006/math" xmlns:v="urn:schemas-microsoft-com:vml" xmlns:wp14="http://schemas.microsoft.com/office/word/2010/wordprocessingDrawing" xmlns:wp="http://schemas.openxmlformats.org/drawingml/2006/wordprocessingDrawing" xmlns:w10="urn:schemas-microsoft-com:office:word" xmlns:w="http://schemas.openxmlformats.org/wordprocessingml/2006/main" xmlns:w14="http://schemas.microsoft.com/office/word/2010/wordml" xmlns:w15="http://schemas.microsoft.com/office/word/2012/wordml" xmlns:w16cex="http://schemas.microsoft.com/office/word/2018/wordml/cex" xmlns:w16cid="http://schemas.microsoft.com/office/word/2016/wordml/cid" xmlns:w16="http://schemas.microsoft.com/office/word/2018/wordml" xmlns:w16sdtdh="http://schemas.microsoft.com/office/word/2020/wordml/sdtdatahash" xmlns:w16se="http://schemas.microsoft.com/office/word/2015/wordml/symex" xmlns:wpg="http://schemas.microsoft.com/office/word/2010/wordprocessingGroup" xmlns:wpi="http://schemas.microsoft.com/office/word/2010/wordprocessingInk" xmlns:wne="http://schemas.microsoft.com/office/word/2006/wordml" xmlns:wps="http://schemas.microsoft.com/office/word/2010/wordprocessingShape" mc:Ignorable="w14 w15 w16se w16cid w16 w16cex w16sdtdh wp14">
   <w:endnote w:type="separator" w:id="-1">
     <w:p>
       <w:r>
@@ -1998,7 +2042,7 @@
 </file>
 
 <file path=word/footnotes.xml><?xml version="1.0" encoding="utf-8"?>
-<w:footnotes xmlns:wpc="http://schemas.microsoft.com/office/word/2010/wordprocessingCanvas" xmlns:cx="http://schemas.microsoft.com/office/drawing/2014/chartex" xmlns:mc="http://schemas.openxmlformats.org/markup-compatibility/2006" xmlns:o="urn:schemas-microsoft-com:office:office" xmlns:r="http://schemas.openxmlformats.org/officeDocument/2006/relationships" xmlns:m="http://schemas.openxmlformats.org/officeDocument/2006/math" xmlns:v="urn:schemas-microsoft-com:vml" xmlns:wp14="http://schemas.microsoft.com/office/word/2010/wordprocessingDrawing" xmlns:wp="http://schemas.openxmlformats.org/drawingml/2006/wordprocessingDrawing" xmlns:w10="urn:schemas-microsoft-com:office:word" xmlns:w="http://schemas.openxmlformats.org/wordprocessingml/2006/main" xmlns:w14="http://schemas.microsoft.com/office/word/2010/wordml" xmlns:w15="http://schemas.microsoft.com/office/word/2012/wordml" xmlns:w16se="http://schemas.microsoft.com/office/word/2015/wordml/symex" xmlns:wpg="http://schemas.microsoft.com/office/word/2010/wordprocessingGroup" xmlns:wpi="http://schemas.microsoft.com/office/word/2010/wordprocessingInk" xmlns:wne="http://schemas.microsoft.com/office/word/2006/wordml" xmlns:wps="http://schemas.microsoft.com/office/word/2010/wordprocessingShape" mc:Ignorable="w14 w15 w16se wp14">
+<w:footnotes xmlns:wpc="http://schemas.microsoft.com/office/word/2010/wordprocessingCanvas" xmlns:cx="http://schemas.microsoft.com/office/drawing/2014/chartex" xmlns:cx1="http://schemas.microsoft.com/office/drawing/2015/9/8/chartex" xmlns:cx2="http://schemas.microsoft.com/office/drawing/2015/10/21/chartex" xmlns:cx3="http://schemas.microsoft.com/office/drawing/2016/5/9/chartex" xmlns:cx4="http://schemas.microsoft.com/office/drawing/2016/5/10/chartex" xmlns:cx5="http://schemas.microsoft.com/office/drawing/2016/5/11/chartex" xmlns:cx6="http://schemas.microsoft.com/office/drawing/2016/5/12/chartex" xmlns:cx7="http://schemas.microsoft.com/office/drawing/2016/5/13/chartex" xmlns:cx8="http://schemas.microsoft.com/office/drawing/2016/5/14/chartex" xmlns:mc="http://schemas.openxmlformats.org/markup-compatibility/2006" xmlns:aink="http://schemas.microsoft.com/office/drawing/2016/ink" xmlns:am3d="http://schemas.microsoft.com/office/drawing/2017/model3d" xmlns:o="urn:schemas-microsoft-com:office:office" xmlns:r="http://schemas.openxmlformats.org/officeDocument/2006/relationships" xmlns:m="http://schemas.openxmlformats.org/officeDocument/2006/math" xmlns:v="urn:schemas-microsoft-com:vml" xmlns:wp14="http://schemas.microsoft.com/office/word/2010/wordprocessingDrawing" xmlns:wp="http://schemas.openxmlformats.org/drawingml/2006/wordprocessingDrawing" xmlns:w10="urn:schemas-microsoft-com:office:word" xmlns:w="http://schemas.openxmlformats.org/wordprocessingml/2006/main" xmlns:w14="http://schemas.microsoft.com/office/word/2010/wordml" xmlns:w15="http://schemas.microsoft.com/office/word/2012/wordml" xmlns:w16cex="http://schemas.microsoft.com/office/word/2018/wordml/cex" xmlns:w16cid="http://schemas.microsoft.com/office/word/2016/wordml/cid" xmlns:w16="http://schemas.microsoft.com/office/word/2018/wordml" xmlns:w16sdtdh="http://schemas.microsoft.com/office/word/2020/wordml/sdtdatahash" xmlns:w16se="http://schemas.microsoft.com/office/word/2015/wordml/symex" xmlns:wpg="http://schemas.microsoft.com/office/word/2010/wordprocessingGroup" xmlns:wpi="http://schemas.microsoft.com/office/word/2010/wordprocessingInk" xmlns:wne="http://schemas.microsoft.com/office/word/2006/wordml" xmlns:wps="http://schemas.microsoft.com/office/word/2010/wordprocessingShape" mc:Ignorable="w14 w15 w16se w16cid w16 w16cex w16sdtdh wp14">
   <w:footnote w:type="separator" w:id="-1">
     <w:p>
       <w:r>
@@ -2017,7 +2061,7 @@
 </file>
 
 <file path=word/header1.xml><?xml version="1.0" encoding="utf-8"?>
-<w:hdr xmlns:wpc="http://schemas.microsoft.com/office/word/2010/wordprocessingCanvas" xmlns:cx="http://schemas.microsoft.com/office/drawing/2014/chartex" xmlns:mc="http://schemas.openxmlformats.org/markup-compatibility/2006" xmlns:o="urn:schemas-microsoft-com:office:office" xmlns:r="http://schemas.openxmlformats.org/officeDocument/2006/relationships" xmlns:m="http://schemas.openxmlformats.org/officeDocument/2006/math" xmlns:v="urn:schemas-microsoft-com:vml" xmlns:wp14="http://schemas.microsoft.com/office/word/2010/wordprocessingDrawing" xmlns:wp="http://schemas.openxmlformats.org/drawingml/2006/wordprocessingDrawing" xmlns:w10="urn:schemas-microsoft-com:office:word" xmlns:w="http://schemas.openxmlformats.org/wordprocessingml/2006/main" xmlns:w14="http://schemas.microsoft.com/office/word/2010/wordml" xmlns:w15="http://schemas.microsoft.com/office/word/2012/wordml" xmlns:w16se="http://schemas.microsoft.com/office/word/2015/wordml/symex" xmlns:wpg="http://schemas.microsoft.com/office/word/2010/wordprocessingGroup" xmlns:wpi="http://schemas.microsoft.com/office/word/2010/wordprocessingInk" xmlns:wne="http://schemas.microsoft.com/office/word/2006/wordml" xmlns:wps="http://schemas.microsoft.com/office/word/2010/wordprocessingShape" mc:Ignorable="w14 w15 w16se wp14">
+<w:hdr xmlns:wpc="http://schemas.microsoft.com/office/word/2010/wordprocessingCanvas" xmlns:cx="http://schemas.microsoft.com/office/drawing/2014/chartex" xmlns:cx1="http://schemas.microsoft.com/office/drawing/2015/9/8/chartex" xmlns:cx2="http://schemas.microsoft.com/office/drawing/2015/10/21/chartex" xmlns:cx3="http://schemas.microsoft.com/office/drawing/2016/5/9/chartex" xmlns:cx4="http://schemas.microsoft.com/office/drawing/2016/5/10/chartex" xmlns:cx5="http://schemas.microsoft.com/office/drawing/2016/5/11/chartex" xmlns:cx6="http://schemas.microsoft.com/office/drawing/2016/5/12/chartex" xmlns:cx7="http://schemas.microsoft.com/office/drawing/2016/5/13/chartex" xmlns:cx8="http://schemas.microsoft.com/office/drawing/2016/5/14/chartex" xmlns:mc="http://schemas.openxmlformats.org/markup-compatibility/2006" xmlns:aink="http://schemas.microsoft.com/office/drawing/2016/ink" xmlns:am3d="http://schemas.microsoft.com/office/drawing/2017/model3d" xmlns:o="urn:schemas-microsoft-com:office:office" xmlns:r="http://schemas.openxmlformats.org/officeDocument/2006/relationships" xmlns:m="http://schemas.openxmlformats.org/officeDocument/2006/math" xmlns:v="urn:schemas-microsoft-com:vml" xmlns:wp14="http://schemas.microsoft.com/office/word/2010/wordprocessingDrawing" xmlns:wp="http://schemas.openxmlformats.org/drawingml/2006/wordprocessingDrawing" xmlns:w10="urn:schemas-microsoft-com:office:word" xmlns:w="http://schemas.openxmlformats.org/wordprocessingml/2006/main" xmlns:w14="http://schemas.microsoft.com/office/word/2010/wordml" xmlns:w15="http://schemas.microsoft.com/office/word/2012/wordml" xmlns:w16cex="http://schemas.microsoft.com/office/word/2018/wordml/cex" xmlns:w16cid="http://schemas.microsoft.com/office/word/2016/wordml/cid" xmlns:w16="http://schemas.microsoft.com/office/word/2018/wordml" xmlns:w16sdtdh="http://schemas.microsoft.com/office/word/2020/wordml/sdtdatahash" xmlns:w16se="http://schemas.microsoft.com/office/word/2015/wordml/symex" xmlns:wpg="http://schemas.microsoft.com/office/word/2010/wordprocessingGroup" xmlns:wpi="http://schemas.microsoft.com/office/word/2010/wordprocessingInk" xmlns:wne="http://schemas.microsoft.com/office/word/2006/wordml" xmlns:wps="http://schemas.microsoft.com/office/word/2010/wordprocessingShape" mc:Ignorable="w14 w15 w16se w16cid w16 w16cex w16sdtdh wp14">
   <w:sdt>
     <w:sdtPr>
       <w:id w:val="-1742249391"/>
@@ -2064,7 +2108,7 @@
             <w:rFonts w:ascii="Times New Roman" w:hAnsi="Times New Roman"/>
             <w:noProof/>
           </w:rPr>
-          <w:t>3</w:t>
+          <w:t>2</w:t>
         </w:r>
         <w:r>
           <w:rPr>
@@ -2080,7 +2124,7 @@
 </file>
 
 <file path=word/numbering.xml><?xml version="1.0" encoding="utf-8"?>
-<w:numbering xmlns:wpc="http://schemas.microsoft.com/office/word/2010/wordprocessingCanvas" xmlns:cx="http://schemas.microsoft.com/office/drawing/2014/chartex" xmlns:mc="http://schemas.openxmlformats.org/markup-compatibility/2006" xmlns:o="urn:schemas-microsoft-com:office:office" xmlns:r="http://schemas.openxmlformats.org/officeDocument/2006/relationships" xmlns:m="http://schemas.openxmlformats.org/officeDocument/2006/math" xmlns:v="urn:schemas-microsoft-com:vml" xmlns:wp14="http://schemas.microsoft.com/office/word/2010/wordprocessingDrawing" xmlns:wp="http://schemas.openxmlformats.org/drawingml/2006/wordprocessingDrawing" xmlns:w10="urn:schemas-microsoft-com:office:word" xmlns:w="http://schemas.openxmlformats.org/wordprocessingml/2006/main" xmlns:w14="http://schemas.microsoft.com/office/word/2010/wordml" xmlns:w15="http://schemas.microsoft.com/office/word/2012/wordml" xmlns:w16se="http://schemas.microsoft.com/office/word/2015/wordml/symex" xmlns:wpg="http://schemas.microsoft.com/office/word/2010/wordprocessingGroup" xmlns:wpi="http://schemas.microsoft.com/office/word/2010/wordprocessingInk" xmlns:wne="http://schemas.microsoft.com/office/word/2006/wordml" xmlns:wps="http://schemas.microsoft.com/office/word/2010/wordprocessingShape" mc:Ignorable="w14 w15 w16se wp14">
+<w:numbering xmlns:wpc="http://schemas.microsoft.com/office/word/2010/wordprocessingCanvas" xmlns:cx="http://schemas.microsoft.com/office/drawing/2014/chartex" xmlns:cx1="http://schemas.microsoft.com/office/drawing/2015/9/8/chartex" xmlns:cx2="http://schemas.microsoft.com/office/drawing/2015/10/21/chartex" xmlns:cx3="http://schemas.microsoft.com/office/drawing/2016/5/9/chartex" xmlns:cx4="http://schemas.microsoft.com/office/drawing/2016/5/10/chartex" xmlns:cx5="http://schemas.microsoft.com/office/drawing/2016/5/11/chartex" xmlns:cx6="http://schemas.microsoft.com/office/drawing/2016/5/12/chartex" xmlns:cx7="http://schemas.microsoft.com/office/drawing/2016/5/13/chartex" xmlns:cx8="http://schemas.microsoft.com/office/drawing/2016/5/14/chartex" xmlns:mc="http://schemas.openxmlformats.org/markup-compatibility/2006" xmlns:aink="http://schemas.microsoft.com/office/drawing/2016/ink" xmlns:am3d="http://schemas.microsoft.com/office/drawing/2017/model3d" xmlns:o="urn:schemas-microsoft-com:office:office" xmlns:r="http://schemas.openxmlformats.org/officeDocument/2006/relationships" xmlns:m="http://schemas.openxmlformats.org/officeDocument/2006/math" xmlns:v="urn:schemas-microsoft-com:vml" xmlns:wp14="http://schemas.microsoft.com/office/word/2010/wordprocessingDrawing" xmlns:wp="http://schemas.openxmlformats.org/drawingml/2006/wordprocessingDrawing" xmlns:w10="urn:schemas-microsoft-com:office:word" xmlns:w="http://schemas.openxmlformats.org/wordprocessingml/2006/main" xmlns:w14="http://schemas.microsoft.com/office/word/2010/wordml" xmlns:w15="http://schemas.microsoft.com/office/word/2012/wordml" xmlns:w16cex="http://schemas.microsoft.com/office/word/2018/wordml/cex" xmlns:w16cid="http://schemas.microsoft.com/office/word/2016/wordml/cid" xmlns:w16="http://schemas.microsoft.com/office/word/2018/wordml" xmlns:w16sdtdh="http://schemas.microsoft.com/office/word/2020/wordml/sdtdatahash" xmlns:w16se="http://schemas.microsoft.com/office/word/2015/wordml/symex" xmlns:wpg="http://schemas.microsoft.com/office/word/2010/wordprocessingGroup" xmlns:wpi="http://schemas.microsoft.com/office/word/2010/wordprocessingInk" xmlns:wne="http://schemas.microsoft.com/office/word/2006/wordml" xmlns:wps="http://schemas.microsoft.com/office/word/2010/wordprocessingShape" mc:Ignorable="w14 w15 w16se w16cid w16 w16cex w16sdtdh wp14">
   <w:abstractNum w:abstractNumId="0" w15:restartNumberingAfterBreak="0">
     <w:nsid w:val="0776587A"/>
     <w:multiLevelType w:val="hybridMultilevel"/>
@@ -3294,7 +3338,7 @@
 </file>
 
 <file path=word/styles.xml><?xml version="1.0" encoding="utf-8"?>
-<w:styles xmlns:mc="http://schemas.openxmlformats.org/markup-compatibility/2006" xmlns:r="http://schemas.openxmlformats.org/officeDocument/2006/relationships" xmlns:w="http://schemas.openxmlformats.org/wordprocessingml/2006/main" xmlns:w14="http://schemas.microsoft.com/office/word/2010/wordml" xmlns:w15="http://schemas.microsoft.com/office/word/2012/wordml" xmlns:w16se="http://schemas.microsoft.com/office/word/2015/wordml/symex" mc:Ignorable="w14 w15 w16se">
+<w:styles xmlns:mc="http://schemas.openxmlformats.org/markup-compatibility/2006" xmlns:r="http://schemas.openxmlformats.org/officeDocument/2006/relationships" xmlns:w="http://schemas.openxmlformats.org/wordprocessingml/2006/main" xmlns:w14="http://schemas.microsoft.com/office/word/2010/wordml" xmlns:w15="http://schemas.microsoft.com/office/word/2012/wordml" xmlns:w16cex="http://schemas.microsoft.com/office/word/2018/wordml/cex" xmlns:w16cid="http://schemas.microsoft.com/office/word/2016/wordml/cid" xmlns:w16="http://schemas.microsoft.com/office/word/2018/wordml" xmlns:w16sdtdh="http://schemas.microsoft.com/office/word/2020/wordml/sdtdatahash" xmlns:w16se="http://schemas.microsoft.com/office/word/2015/wordml/symex" mc:Ignorable="w14 w15 w16se w16cid w16 w16cex w16sdtdh">
   <w:docDefaults>
     <w:rPrDefault>
       <w:rPr>
@@ -3304,7 +3348,7 @@
     </w:rPrDefault>
     <w:pPrDefault/>
   </w:docDefaults>
-  <w:latentStyles w:defLockedState="0" w:defUIPriority="99" w:defSemiHidden="0" w:defUnhideWhenUsed="0" w:defQFormat="0" w:count="371">
+  <w:latentStyles w:defLockedState="0" w:defUIPriority="99" w:defSemiHidden="0" w:defUnhideWhenUsed="0" w:defQFormat="0" w:count="376">
     <w:lsdException w:name="Normal" w:uiPriority="0" w:qFormat="1"/>
     <w:lsdException w:name="heading 1" w:uiPriority="0" w:qFormat="1"/>
     <w:lsdException w:name="heading 2" w:uiPriority="9" w:qFormat="1"/>
@@ -3410,7 +3454,6 @@
     <w:lsdException w:name="HTML Sample" w:semiHidden="1" w:unhideWhenUsed="1"/>
     <w:lsdException w:name="HTML Typewriter" w:semiHidden="1" w:unhideWhenUsed="1"/>
     <w:lsdException w:name="HTML Variable" w:semiHidden="1" w:unhideWhenUsed="1"/>
-    <w:lsdException w:name="Normal Table" w:semiHidden="1" w:unhideWhenUsed="1"/>
     <w:lsdException w:name="annotation subject" w:semiHidden="1" w:unhideWhenUsed="1"/>
     <w:lsdException w:name="No List" w:semiHidden="1" w:unhideWhenUsed="1"/>
     <w:lsdException w:name="Outline List 1" w:semiHidden="1" w:unhideWhenUsed="1"/>
@@ -3453,11 +3496,8 @@
     <w:lsdException w:name="Table Contemporary" w:semiHidden="1" w:unhideWhenUsed="1"/>
     <w:lsdException w:name="Table Elegant" w:semiHidden="1" w:unhideWhenUsed="1"/>
     <w:lsdException w:name="Table Professional" w:semiHidden="1" w:unhideWhenUsed="1"/>
-    <w:lsdException w:name="Table Subtle 1" w:semiHidden="1" w:unhideWhenUsed="1"/>
     <w:lsdException w:name="Table Subtle 2" w:semiHidden="1" w:unhideWhenUsed="1"/>
     <w:lsdException w:name="Table Web 1" w:semiHidden="1" w:unhideWhenUsed="1"/>
-    <w:lsdException w:name="Table Web 2" w:semiHidden="1" w:unhideWhenUsed="1"/>
-    <w:lsdException w:name="Table Web 3" w:semiHidden="1" w:unhideWhenUsed="1"/>
     <w:lsdException w:name="Balloon Text" w:semiHidden="1" w:unhideWhenUsed="1"/>
     <w:lsdException w:name="Table Grid" w:uiPriority="39"/>
     <w:lsdException w:name="Table Theme" w:semiHidden="1" w:unhideWhenUsed="1"/>
@@ -3676,6 +3716,11 @@
     <w:lsdException w:name="List Table 5 Dark Accent 6" w:uiPriority="50"/>
     <w:lsdException w:name="List Table 6 Colorful Accent 6" w:uiPriority="51"/>
     <w:lsdException w:name="List Table 7 Colorful Accent 6" w:uiPriority="52"/>
+    <w:lsdException w:name="Mention" w:semiHidden="1" w:unhideWhenUsed="1"/>
+    <w:lsdException w:name="Smart Hyperlink" w:semiHidden="1" w:unhideWhenUsed="1"/>
+    <w:lsdException w:name="Hashtag" w:semiHidden="1" w:unhideWhenUsed="1"/>
+    <w:lsdException w:name="Unresolved Mention" w:semiHidden="1" w:unhideWhenUsed="1"/>
+    <w:lsdException w:name="Smart Link" w:semiHidden="1" w:unhideWhenUsed="1"/>
   </w:latentStyles>
   <w:style w:type="paragraph" w:default="1" w:styleId="Normal">
     <w:name w:val="Normal"/>
@@ -4537,7 +4582,7 @@
 </file>
 
 <file path=customXml/itemProps1.xml><?xml version="1.0" encoding="utf-8"?>
-<ds:datastoreItem xmlns:ds="http://schemas.openxmlformats.org/officeDocument/2006/customXml" ds:itemID="{13DAFC0F-5042-4CB5-A0C0-D4F17E5BD916}">
+<ds:datastoreItem xmlns:ds="http://schemas.openxmlformats.org/officeDocument/2006/customXml" ds:itemID="{774C89FB-BFAC-473C-A054-B8A61112B124}">
   <ds:schemaRefs>
     <ds:schemaRef ds:uri="http://schemas.openxmlformats.org/officeDocument/2006/bibliography"/>
   </ds:schemaRefs>

</xml_diff>